<commit_message>
Memoria Sprint 3 terminada
</commit_message>
<xml_diff>
--- a/Memoria/MemoriaSprint2.docx
+++ b/Memoria/MemoriaSprint2.docx
@@ -2123,21 +2123,7 @@
           <w:b/>
           <w:bCs/>
         </w:rPr>
-        <w:t xml:space="preserve">Sprint </w:t>
-      </w:r>
-      <w:r>
-        <w:rPr>
-          <w:b/>
-          <w:bCs/>
-        </w:rPr>
-        <w:t>2</w:t>
-      </w:r>
-      <w:r>
-        <w:rPr>
-          <w:b/>
-          <w:bCs/>
-        </w:rPr>
-        <w:t>:</w:t>
+        <w:t>Sprint 2:</w:t>
       </w:r>
       <w:bookmarkEnd w:id="2"/>
     </w:p>
@@ -2627,25 +2613,20 @@
     </w:p>
     <w:p>
       <w:pPr>
-        <w:rPr>
-          <w:sz w:val="24"/>
-        </w:rPr>
-      </w:pPr>
-    </w:p>
-    <w:p/>
-    <w:p>
-      <w:pPr>
         <w:jc w:val="left"/>
         <w:rPr>
-          <w:rFonts w:asciiTheme="majorHAnsi" w:eastAsiaTheme="majorEastAsia" w:hAnsiTheme="majorHAnsi" w:cstheme="majorBidi"/>
-          <w:color w:val="2F5496" w:themeColor="accent1" w:themeShade="BF"/>
-          <w:sz w:val="40"/>
-          <w:szCs w:val="40"/>
-        </w:rPr>
-      </w:pPr>
-      <w:r>
+          <w:b/>
+          <w:bCs/>
+          <w:sz w:val="24"/>
+        </w:rPr>
+      </w:pPr>
+      <w:r>
+        <w:rPr>
+          <w:sz w:val="24"/>
+        </w:rPr>
         <w:br w:type="page"/>
       </w:r>
+      <w:bookmarkStart w:id="3" w:name="_Toc214215324"/>
     </w:p>
     <w:p>
       <w:pPr>
@@ -2654,9 +2635,10 @@
         <w:rPr>
           <w:b/>
           <w:bCs/>
-        </w:rPr>
-      </w:pPr>
-      <w:bookmarkStart w:id="3" w:name="_Toc214215324"/>
+          <w:sz w:val="24"/>
+          <w:szCs w:val="24"/>
+        </w:rPr>
+      </w:pPr>
     </w:p>
     <w:p>
       <w:pPr>
@@ -2965,7 +2947,7 @@
       <w:lvlText w:val="%1."/>
       <w:lvlJc w:val="left"/>
       <w:pPr>
-        <w:ind w:left="720" w:hanging="360"/>
+        <w:ind w:left="501" w:hanging="360"/>
       </w:pPr>
       <w:rPr>
         <w:rFonts w:hint="default"/>
@@ -4528,14 +4510,14 @@
     <w:charset w:val="00"/>
     <w:family w:val="roman"/>
     <w:pitch w:val="variable"/>
-    <w:sig w:usb0="E0002EFF" w:usb1="C000785B" w:usb2="00000009" w:usb3="00000000" w:csb0="000001FF" w:csb1="00000000"/>
+    <w:sig w:usb0="E0002AFF" w:usb1="C0007843" w:usb2="00000009" w:usb3="00000000" w:csb0="000001FF" w:csb1="00000000"/>
   </w:font>
   <w:font w:name="Calibri">
     <w:panose1 w:val="020F0502020204030204"/>
     <w:charset w:val="00"/>
     <w:family w:val="swiss"/>
     <w:pitch w:val="variable"/>
-    <w:sig w:usb0="E4002EFF" w:usb1="C000247B" w:usb2="00000009" w:usb3="00000000" w:csb0="000001FF" w:csb1="00000000"/>
+    <w:sig w:usb0="E0002AFF" w:usb1="4000ACFF" w:usb2="00000001" w:usb3="00000000" w:csb0="000001FF" w:csb1="00000000"/>
   </w:font>
   <w:font w:name="Courier New">
     <w:panose1 w:val="02070309020205020404"/>
@@ -4563,7 +4545,7 @@
     <w:charset w:val="00"/>
     <w:family w:val="swiss"/>
     <w:pitch w:val="variable"/>
-    <w:sig w:usb0="E4002EFF" w:usb1="C000247B" w:usb2="00000009" w:usb3="00000000" w:csb0="000001FF" w:csb1="00000000"/>
+    <w:sig w:usb0="A0002AEF" w:usb1="4000207B" w:usb2="00000000" w:usb3="00000000" w:csb0="000001FF" w:csb1="00000000"/>
   </w:font>
 </w:fonts>
 </file>
@@ -4586,6 +4568,7 @@
   <w:rsids>
     <w:rsidRoot w:val="00DB76CF"/>
     <w:rsid w:val="001152F9"/>
+    <w:rsid w:val="00282CEC"/>
     <w:rsid w:val="007E2843"/>
     <w:rsid w:val="008A7CE9"/>
     <w:rsid w:val="00AC7D40"/>

</xml_diff>